<commit_message>
Pushing Assignment 1.3 6/7/2026
</commit_message>
<xml_diff>
--- a/module-1/Walmsley-Assignment1_2.docx
+++ b/module-1/Walmsley-Assignment1_2.docx
@@ -42,6 +42,46 @@
           <w:numId w:val="1"/>
         </w:numPr>
       </w:pPr>
+      <w:r>
+        <w:rPr>
+          <w:noProof/>
+        </w:rPr>
+        <w:drawing>
+          <wp:inline distT="0" distB="0" distL="0" distR="0" wp14:anchorId="217042DE" wp14:editId="477A0D2A">
+            <wp:extent cx="4735685" cy="3383280"/>
+            <wp:effectExtent l="0" t="0" r="8255" b="7620"/>
+            <wp:docPr id="986616048" name="Picture 1"/>
+            <wp:cNvGraphicFramePr>
+              <a:graphicFrameLocks xmlns:a="http://schemas.openxmlformats.org/drawingml/2006/main" noChangeAspect="1"/>
+            </wp:cNvGraphicFramePr>
+            <a:graphic xmlns:a="http://schemas.openxmlformats.org/drawingml/2006/main">
+              <a:graphicData uri="http://schemas.openxmlformats.org/drawingml/2006/picture">
+                <pic:pic xmlns:pic="http://schemas.openxmlformats.org/drawingml/2006/picture">
+                  <pic:nvPicPr>
+                    <pic:cNvPr id="986616048" name=""/>
+                    <pic:cNvPicPr/>
+                  </pic:nvPicPr>
+                  <pic:blipFill>
+                    <a:blip r:embed="rId6"/>
+                    <a:stretch>
+                      <a:fillRect/>
+                    </a:stretch>
+                  </pic:blipFill>
+                  <pic:spPr>
+                    <a:xfrm>
+                      <a:off x="0" y="0"/>
+                      <a:ext cx="4735685" cy="3383280"/>
+                    </a:xfrm>
+                    <a:prstGeom prst="rect">
+                      <a:avLst/>
+                    </a:prstGeom>
+                  </pic:spPr>
+                </pic:pic>
+              </a:graphicData>
+            </a:graphic>
+          </wp:inline>
+        </w:drawing>
+      </w:r>
     </w:p>
     <w:p/>
     <w:p>
@@ -72,7 +112,7 @@
                     <pic:cNvPicPr/>
                   </pic:nvPicPr>
                   <pic:blipFill>
-                    <a:blip r:embed="rId6"/>
+                    <a:blip r:embed="rId7"/>
                     <a:stretch>
                       <a:fillRect/>
                     </a:stretch>
@@ -93,8 +133,6 @@
         </w:drawing>
       </w:r>
     </w:p>
-    <w:p/>
-    <w:p/>
     <w:sectPr>
       <w:pgSz w:w="12240" w:h="15840"/>
       <w:pgMar w:top="1440" w:right="1440" w:bottom="1440" w:left="1440" w:header="720" w:footer="720" w:gutter="0"/>

</xml_diff>